<commit_message>
Update clients/imk/KP_IMK.docx - corrected savings
</commit_message>
<xml_diff>
--- a/clients/imk/KP_IMK.docx
+++ b/clients/imk/KP_IMK.docx
@@ -109,7 +109,7 @@
       <w:tr>
         <w:tc>
           <w:tcPr>
-            <w:tcW w:type="dxa" w:w="3168"/>
+            <w:tcW w:type="dxa" w:w="4320"/>
           </w:tcPr>
           <w:p>
             <w:r>
@@ -123,7 +123,7 @@
         </w:tc>
         <w:tc>
           <w:tcPr>
-            <w:tcW w:type="dxa" w:w="5760"/>
+            <w:tcW w:type="dxa" w:w="4320"/>
           </w:tcPr>
           <w:p>
             <w:r>
@@ -138,7 +138,7 @@
       <w:tr>
         <w:tc>
           <w:tcPr>
-            <w:tcW w:type="dxa" w:w="3168"/>
+            <w:tcW w:type="dxa" w:w="4320"/>
             <w:shd w:val="clear" w:color="auto" w:fill="F5F5F5"/>
           </w:tcPr>
           <w:p>
@@ -153,7 +153,7 @@
         </w:tc>
         <w:tc>
           <w:tcPr>
-            <w:tcW w:type="dxa" w:w="5760"/>
+            <w:tcW w:type="dxa" w:w="4320"/>
             <w:shd w:val="clear" w:color="auto" w:fill="F5F5F5"/>
           </w:tcPr>
           <w:p>
@@ -169,7 +169,7 @@
       <w:tr>
         <w:tc>
           <w:tcPr>
-            <w:tcW w:type="dxa" w:w="3168"/>
+            <w:tcW w:type="dxa" w:w="4320"/>
           </w:tcPr>
           <w:p>
             <w:r>
@@ -183,7 +183,7 @@
         </w:tc>
         <w:tc>
           <w:tcPr>
-            <w:tcW w:type="dxa" w:w="5760"/>
+            <w:tcW w:type="dxa" w:w="4320"/>
           </w:tcPr>
           <w:p>
             <w:r>
@@ -198,7 +198,7 @@
       <w:tr>
         <w:tc>
           <w:tcPr>
-            <w:tcW w:type="dxa" w:w="3168"/>
+            <w:tcW w:type="dxa" w:w="4320"/>
             <w:shd w:val="clear" w:color="auto" w:fill="F5F5F5"/>
           </w:tcPr>
           <w:p>
@@ -213,7 +213,7 @@
         </w:tc>
         <w:tc>
           <w:tcPr>
-            <w:tcW w:type="dxa" w:w="5760"/>
+            <w:tcW w:type="dxa" w:w="4320"/>
             <w:shd w:val="clear" w:color="auto" w:fill="F5F5F5"/>
           </w:tcPr>
           <w:p>
@@ -229,7 +229,7 @@
       <w:tr>
         <w:tc>
           <w:tcPr>
-            <w:tcW w:type="dxa" w:w="3168"/>
+            <w:tcW w:type="dxa" w:w="4320"/>
           </w:tcPr>
           <w:p>
             <w:r>
@@ -243,7 +243,7 @@
         </w:tc>
         <w:tc>
           <w:tcPr>
-            <w:tcW w:type="dxa" w:w="5760"/>
+            <w:tcW w:type="dxa" w:w="4320"/>
           </w:tcPr>
           <w:p>
             <w:r>
@@ -258,7 +258,7 @@
       <w:tr>
         <w:tc>
           <w:tcPr>
-            <w:tcW w:type="dxa" w:w="3168"/>
+            <w:tcW w:type="dxa" w:w="4320"/>
             <w:shd w:val="clear" w:color="auto" w:fill="F5F5F5"/>
           </w:tcPr>
           <w:p>
@@ -273,7 +273,7 @@
         </w:tc>
         <w:tc>
           <w:tcPr>
-            <w:tcW w:type="dxa" w:w="5760"/>
+            <w:tcW w:type="dxa" w:w="4320"/>
             <w:shd w:val="clear" w:color="auto" w:fill="F5F5F5"/>
           </w:tcPr>
           <w:p>
@@ -289,7 +289,7 @@
       <w:tr>
         <w:tc>
           <w:tcPr>
-            <w:tcW w:type="dxa" w:w="3168"/>
+            <w:tcW w:type="dxa" w:w="4320"/>
           </w:tcPr>
           <w:p>
             <w:r>
@@ -303,7 +303,7 @@
         </w:tc>
         <w:tc>
           <w:tcPr>
-            <w:tcW w:type="dxa" w:w="5760"/>
+            <w:tcW w:type="dxa" w:w="4320"/>
           </w:tcPr>
           <w:p>
             <w:r>
@@ -318,7 +318,7 @@
       <w:tr>
         <w:tc>
           <w:tcPr>
-            <w:tcW w:type="dxa" w:w="3168"/>
+            <w:tcW w:type="dxa" w:w="4320"/>
             <w:shd w:val="clear" w:color="auto" w:fill="F5F5F5"/>
           </w:tcPr>
           <w:p>
@@ -333,7 +333,7 @@
         </w:tc>
         <w:tc>
           <w:tcPr>
-            <w:tcW w:type="dxa" w:w="5760"/>
+            <w:tcW w:type="dxa" w:w="4320"/>
             <w:shd w:val="clear" w:color="auto" w:fill="F5F5F5"/>
           </w:tcPr>
           <w:p>
@@ -474,7 +474,7 @@
                 <w:color w:val="FFFFFF"/>
                 <w:sz w:val="18"/>
               </w:rPr>
-              <w:t>До (ОСН)</w:t>
+              <w:t>До (ОСН/УСН)</w:t>
             </w:r>
           </w:p>
         </w:tc>
@@ -522,7 +522,7 @@
               <w:rPr>
                 <w:sz w:val="18"/>
               </w:rPr>
-              <w:t>Налог на прибыль</w:t>
+              <w:t>Налог на прибыль / УСН</w:t>
             </w:r>
           </w:p>
         </w:tc>
@@ -536,7 +536,7 @@
               <w:rPr>
                 <w:sz w:val="18"/>
               </w:rPr>
-              <w:t>0 руб.</w:t>
+              <w:t>≈ 0 руб.</w:t>
             </w:r>
           </w:p>
         </w:tc>
@@ -592,7 +592,7 @@
               <w:rPr>
                 <w:sz w:val="18"/>
               </w:rPr>
-              <w:t>720 000 руб.</w:t>
+              <w:t>700 000 руб.</w:t>
             </w:r>
           </w:p>
         </w:tc>
@@ -605,7 +605,7 @@
               <w:rPr>
                 <w:sz w:val="18"/>
               </w:rPr>
-              <w:t>360 000 руб.</w:t>
+              <w:t>350 000 руб.</w:t>
             </w:r>
           </w:p>
         </w:tc>
@@ -618,7 +618,7 @@
               <w:rPr>
                 <w:sz w:val="18"/>
               </w:rPr>
-              <w:t>360 000 руб.</w:t>
+              <w:t>350 000 руб.</w:t>
             </w:r>
           </w:p>
         </w:tc>
@@ -648,7 +648,7 @@
               <w:rPr>
                 <w:sz w:val="18"/>
               </w:rPr>
-              <w:t>≈ 100 000 руб. (оценка)</w:t>
+              <w:t>≈ 80 000 руб. (оценка)</w:t>
             </w:r>
           </w:p>
         </w:tc>
@@ -676,7 +676,7 @@
               <w:rPr>
                 <w:sz w:val="18"/>
               </w:rPr>
-              <w:t>≈ 100 000 руб.</w:t>
+              <w:t>≈ 80 000 руб.</w:t>
             </w:r>
           </w:p>
         </w:tc>
@@ -728,7 +728,7 @@
               <w:rPr>
                 <w:sz w:val="18"/>
               </w:rPr>
-              <w:t>460 000 руб.</w:t>
+              <w:t>300 000 руб.</w:t>
             </w:r>
           </w:p>
         </w:tc>
@@ -746,7 +746,7 @@
         <w:rPr>
           <w:sz w:val="20"/>
         </w:rPr>
-        <w:t>Прогноз экономии за 10 лет: 0–0 млн руб.</w:t>
+        <w:t>Прогноз минимальной экономии за 10 лет: 3 млн руб.</w:t>
       </w:r>
     </w:p>
     <w:p>
@@ -872,7 +872,7 @@
               <w:rPr>
                 <w:sz w:val="18"/>
               </w:rPr>
-              <w:t>Сотрудники &gt; 5 чел.</w:t>
+              <w:t>Сотрудники</w:t>
             </w:r>
           </w:p>
         </w:tc>
@@ -886,7 +886,7 @@
               <w:rPr>
                 <w:sz w:val="18"/>
               </w:rPr>
-              <w:t>🔴 Нет</w:t>
+              <w:t>🟢 Да</w:t>
             </w:r>
           </w:p>
         </w:tc>
@@ -1213,61 +1213,6 @@
           <w:sz w:val="20"/>
         </w:rPr>
         <w:t>7. Ежегодная экономия на налогах</w:t>
-      </w:r>
-    </w:p>
-    <w:p>
-      <w:r>
-        <w:rPr>
-          <w:b/>
-          <w:color w:val="2D2D2D"/>
-          <w:sz w:val="22"/>
-        </w:rPr>
-        <w:t>7. Что получает компания</w:t>
-      </w:r>
-    </w:p>
-    <w:p>
-      <w:r>
-        <w:rPr>
-          <w:sz w:val="20"/>
-        </w:rPr>
-        <w:t>✅ Статус резидента Фонда «Сколково»</w:t>
-        <w:br/>
-        <w:t>✅ Налоговую экономию</w:t>
-        <w:br/>
-        <w:t>✅ Патент на полезную модель</w:t>
-        <w:br/>
-        <w:t>✅ Юридическое сопровождение</w:t>
-      </w:r>
-    </w:p>
-    <w:p>
-      <w:r>
-        <w:rPr>
-          <w:sz w:val="20"/>
-        </w:rPr>
-      </w:r>
-    </w:p>
-    <w:p>
-      <w:r>
-        <w:rPr>
-          <w:sz w:val="20"/>
-        </w:rPr>
-        <w:t>С уважением,</w:t>
-      </w:r>
-    </w:p>
-    <w:p>
-      <w:r>
-        <w:rPr>
-          <w:sz w:val="20"/>
-        </w:rPr>
-        <w:t>Консалтинговая компания Andromeda Consult</w:t>
-      </w:r>
-    </w:p>
-    <w:p>
-      <w:r>
-        <w:rPr>
-          <w:sz w:val="20"/>
-        </w:rPr>
-        <w:t>info@andromedaconsult.ru | andromedaconsult.ru</w:t>
       </w:r>
     </w:p>
     <w:sectPr>

</xml_diff>